<commit_message>
Sprint 9: documento cita a atualização do CONTEXTO e do README do frontend
</commit_message>
<xml_diff>
--- a/sprints/sprint-9/BuscaPet-Sprint9.docx
+++ b/sprints/sprint-9/BuscaPet-Sprint9.docx
@@ -15498,6 +15498,87 @@
                 <w:sz w:val="17"/>
                 <w:szCs w:val="17"/>
               </w:rPr>
+              <w:t xml:space="preserve">CONTEXTO.md</w:t>
+            </w:r>
+            <w:r>
+              <w:rPr>
+                <w:sz w:val="19"/>
+                <w:szCs w:val="19"/>
+              </w:rPr>
+              <w:t xml:space="preserve"> e </w:t>
+            </w:r>
+            <w:r>
+              <w:rPr>
+                <w:rFonts w:ascii="Consolas" w:hAnsi="Consolas" w:cs="Consolas"/>
+                <w:sz w:val="17"/>
+                <w:szCs w:val="17"/>
+              </w:rPr>
+              <w:t xml:space="preserve">frontend/README.md</w:t>
+            </w:r>
+          </w:p>
+        </w:tc>
+        <w:tc>
+          <w:tcPr>
+            <w:tcW w:type="dxa" w:w="6237"/>
+            <w:tcBorders>
+              <w:top w:val="single" w:color="BFBFBF" w:sz="4"/>
+              <w:left w:val="single" w:color="BFBFBF" w:sz="4"/>
+              <w:bottom w:val="single" w:color="BFBFBF" w:sz="4"/>
+              <w:right w:val="single" w:color="BFBFBF" w:sz="4"/>
+            </w:tcBorders>
+            <w:tcMar>
+              <w:top w:type="dxa" w:w="60"/>
+              <w:left w:type="dxa" w:w="100"/>
+              <w:bottom w:type="dxa" w:w="60"/>
+              <w:right w:type="dxa" w:w="100"/>
+            </w:tcMar>
+            <w:vAlign w:val="center"/>
+          </w:tcPr>
+          <w:p>
+            <w:pPr>
+              <w:spacing w:after="0"/>
+            </w:pPr>
+            <w:r>
+              <w:rPr>
+                <w:sz w:val="19"/>
+                <w:szCs w:val="19"/>
+              </w:rPr>
+              <w:t xml:space="preserve">Testes das Sprints 6 a 9 (varredura, acessibilidade, validação, SMTP), cor de destaque nova e como rodar em máquina com pouca memória</w:t>
+            </w:r>
+          </w:p>
+        </w:tc>
+      </w:tr>
+      <w:tr>
+        <w:trPr>
+          <w:cantSplit/>
+        </w:trPr>
+        <w:tc>
+          <w:tcPr>
+            <w:tcW w:type="dxa" w:w="3402"/>
+            <w:tcBorders>
+              <w:top w:val="single" w:color="BFBFBF" w:sz="4"/>
+              <w:left w:val="single" w:color="BFBFBF" w:sz="4"/>
+              <w:bottom w:val="single" w:color="BFBFBF" w:sz="4"/>
+              <w:right w:val="single" w:color="BFBFBF" w:sz="4"/>
+            </w:tcBorders>
+            <w:tcMar>
+              <w:top w:type="dxa" w:w="60"/>
+              <w:left w:type="dxa" w:w="100"/>
+              <w:bottom w:type="dxa" w:w="60"/>
+              <w:right w:type="dxa" w:w="100"/>
+            </w:tcMar>
+            <w:vAlign w:val="center"/>
+          </w:tcPr>
+          <w:p>
+            <w:pPr>
+              <w:spacing w:after="0"/>
+            </w:pPr>
+            <w:r>
+              <w:rPr>
+                <w:rFonts w:ascii="Consolas" w:hAnsi="Consolas" w:cs="Consolas"/>
+                <w:sz w:val="17"/>
+                <w:szCs w:val="17"/>
+              </w:rPr>
               <w:t xml:space="preserve">docs/schema.sql</w:t>
             </w:r>
             <w:r>
@@ -16367,6 +16448,73 @@
                 <w:szCs w:val="19"/>
               </w:rPr>
               <w:t xml:space="preserve">Documentação: schema e README</w:t>
+            </w:r>
+          </w:p>
+        </w:tc>
+      </w:tr>
+      <w:tr>
+        <w:trPr>
+          <w:cantSplit/>
+        </w:trPr>
+        <w:tc>
+          <w:tcPr>
+            <w:tcW w:type="dxa" w:w="1701"/>
+            <w:tcBorders>
+              <w:top w:val="single" w:color="BFBFBF" w:sz="4"/>
+              <w:left w:val="single" w:color="BFBFBF" w:sz="4"/>
+              <w:bottom w:val="single" w:color="BFBFBF" w:sz="4"/>
+              <w:right w:val="single" w:color="BFBFBF" w:sz="4"/>
+            </w:tcBorders>
+            <w:tcMar>
+              <w:top w:type="dxa" w:w="60"/>
+              <w:left w:type="dxa" w:w="100"/>
+              <w:bottom w:type="dxa" w:w="60"/>
+              <w:right w:type="dxa" w:w="100"/>
+            </w:tcMar>
+            <w:vAlign w:val="center"/>
+          </w:tcPr>
+          <w:p>
+            <w:pPr>
+              <w:spacing w:after="0"/>
+            </w:pPr>
+            <w:r>
+              <w:rPr>
+                <w:rFonts w:ascii="Consolas" w:hAnsi="Consolas" w:cs="Consolas"/>
+                <w:sz w:val="17"/>
+                <w:szCs w:val="17"/>
+                <w:b/>
+              </w:rPr>
+              <w:t xml:space="preserve">88c61f0</w:t>
+            </w:r>
+          </w:p>
+        </w:tc>
+        <w:tc>
+          <w:tcPr>
+            <w:tcW w:type="dxa" w:w="7938"/>
+            <w:tcBorders>
+              <w:top w:val="single" w:color="BFBFBF" w:sz="4"/>
+              <w:left w:val="single" w:color="BFBFBF" w:sz="4"/>
+              <w:bottom w:val="single" w:color="BFBFBF" w:sz="4"/>
+              <w:right w:val="single" w:color="BFBFBF" w:sz="4"/>
+            </w:tcBorders>
+            <w:tcMar>
+              <w:top w:type="dxa" w:w="60"/>
+              <w:left w:type="dxa" w:w="100"/>
+              <w:bottom w:type="dxa" w:w="60"/>
+              <w:right w:type="dxa" w:w="100"/>
+            </w:tcMar>
+            <w:vAlign w:val="center"/>
+          </w:tcPr>
+          <w:p>
+            <w:pPr>
+              <w:spacing w:after="0"/>
+            </w:pPr>
+            <w:r>
+              <w:rPr>
+                <w:sz w:val="19"/>
+                <w:szCs w:val="19"/>
+              </w:rPr>
+              <w:t xml:space="preserve">Documentação: CONTEXTO e README do frontend</w:t>
             </w:r>
           </w:p>
         </w:tc>

</xml_diff>